<commit_message>
fix mobile scroll ghosting - overflow, transforms, blur filters
</commit_message>
<xml_diff>
--- a/M Faizan Khan.docx
+++ b/M Faizan Khan.docx
@@ -97,7 +97,31 @@
           <w:sz w:val="22"/>
           <w:szCs w:val="22"/>
         </w:rPr>
-        <w:t>m.faizanx7@gmail.com | +92 3430559742 | Islamabad, Pakistan</w:t>
+        <w:t>m</w:t>
+      </w:r>
+      <w:r>
+        <w:rPr>
+          <w:color w:val="555555"/>
+          <w:sz w:val="22"/>
+          <w:szCs w:val="22"/>
+        </w:rPr>
+        <w:t>faizanx</w:t>
+      </w:r>
+      <w:r>
+        <w:rPr>
+          <w:color w:val="555555"/>
+          <w:sz w:val="22"/>
+          <w:szCs w:val="22"/>
+        </w:rPr>
+        <w:t>10</w:t>
+      </w:r>
+      <w:r>
+        <w:rPr>
+          <w:color w:val="555555"/>
+          <w:sz w:val="22"/>
+          <w:szCs w:val="22"/>
+        </w:rPr>
+        <w:t>@gmail.com | +923430559742 | Islamabad, Pakistan</w:t>
       </w:r>
     </w:p>
     <w:p>
@@ -154,6 +178,27 @@
           <w:t>LinkedIn</w:t>
         </w:r>
       </w:hyperlink>
+      <w:r>
+        <w:t xml:space="preserve"> </w:t>
+      </w:r>
+      <w:r>
+        <w:rPr>
+          <w:color w:val="555555"/>
+          <w:sz w:val="22"/>
+          <w:szCs w:val="22"/>
+        </w:rPr>
+        <w:t>|</w:t>
+      </w:r>
+      <w:hyperlink r:id="rId7" w:history="1">
+        <w:r>
+          <w:rPr>
+            <w:rStyle w:val="Hyperlink"/>
+            <w:sz w:val="22"/>
+            <w:szCs w:val="22"/>
+          </w:rPr>
+          <w:t>Portfolio</w:t>
+        </w:r>
+      </w:hyperlink>
     </w:p>
     <w:p>
       <w:pPr>
@@ -518,9 +563,7 @@
     </w:p>
     <w:p>
       <w:pPr>
-        <w:pStyle w:val="ListParagraph"/>
         <w:spacing w:before="30" w:after="30"/>
-        <w:ind w:left="480"/>
         <w:jc w:val="both"/>
         <w:rPr>
           <w:b/>
@@ -603,9 +646,7 @@
     </w:p>
     <w:p>
       <w:pPr>
-        <w:pStyle w:val="ListParagraph"/>
         <w:spacing w:before="30" w:after="30"/>
-        <w:ind w:left="480"/>
         <w:jc w:val="both"/>
         <w:rPr>
           <w:color w:val="000000"/>
@@ -807,7 +848,16 @@
           <w:sz w:val="22"/>
           <w:szCs w:val="22"/>
         </w:rPr>
-        <w:t>December 2025 – January 2026</w:t>
+        <w:t>January 2026</w:t>
+      </w:r>
+      <w:r>
+        <w:rPr>
+          <w:i/>
+          <w:iCs/>
+          <w:sz w:val="22"/>
+          <w:szCs w:val="22"/>
+        </w:rPr>
+        <w:t xml:space="preserve"> – February 2026</w:t>
       </w:r>
     </w:p>
     <w:p>
@@ -856,7 +906,7 @@
         </w:rPr>
         <w:t xml:space="preserve">Worked on the </w:t>
       </w:r>
-      <w:hyperlink r:id="rId7" w:history="1">
+      <w:hyperlink r:id="rId8" w:history="1">
         <w:proofErr w:type="spellStart"/>
         <w:r>
           <w:rPr>
@@ -1029,7 +1079,7 @@
           <w:szCs w:val="22"/>
         </w:rPr>
       </w:pPr>
-      <w:hyperlink r:id="rId8" w:history="1">
+      <w:hyperlink r:id="rId9" w:history="1">
         <w:r>
           <w:rPr>
             <w:rStyle w:val="Hyperlink"/>
@@ -1046,7 +1096,7 @@
         </w:rPr>
         <w:t xml:space="preserve"> | </w:t>
       </w:r>
-      <w:hyperlink r:id="rId9" w:history="1">
+      <w:hyperlink r:id="rId10" w:history="1">
         <w:r>
           <w:rPr>
             <w:rStyle w:val="Hyperlink"/>
@@ -1145,7 +1195,7 @@
           <w:szCs w:val="22"/>
         </w:rPr>
       </w:pPr>
-      <w:hyperlink r:id="rId10" w:history="1">
+      <w:hyperlink r:id="rId11" w:history="1">
         <w:r>
           <w:rPr>
             <w:rStyle w:val="Hyperlink"/>
@@ -1162,7 +1212,7 @@
         </w:rPr>
         <w:t xml:space="preserve"> | </w:t>
       </w:r>
-      <w:hyperlink r:id="rId11" w:history="1">
+      <w:hyperlink r:id="rId12" w:history="1">
         <w:r>
           <w:rPr>
             <w:rStyle w:val="Hyperlink"/>
@@ -1212,7 +1262,7 @@
           <w:sz w:val="22"/>
           <w:szCs w:val="22"/>
         </w:rPr>
-        <w:t>Perfect Doors Website &amp; CMS</w:t>
+        <w:t xml:space="preserve">Perfect Doors Website </w:t>
       </w:r>
     </w:p>
     <w:p>
@@ -1255,7 +1305,7 @@
           <w:szCs w:val="22"/>
         </w:rPr>
       </w:pPr>
-      <w:hyperlink r:id="rId12" w:history="1">
+      <w:hyperlink r:id="rId13" w:history="1">
         <w:r>
           <w:rPr>
             <w:rStyle w:val="Hyperlink"/>
@@ -1272,7 +1322,7 @@
         </w:rPr>
         <w:t xml:space="preserve"> | </w:t>
       </w:r>
-      <w:hyperlink r:id="rId13" w:history="1">
+      <w:hyperlink r:id="rId14" w:history="1">
         <w:r>
           <w:rPr>
             <w:rStyle w:val="Hyperlink"/>

</xml_diff>